<commit_message>
docs(competitors): dated to the day, and the three things that moved since 11 September
Paul: "Update the competitor analysis marking it with today's date not just
this month." Both stamps (header, Sources) now read 14 September 2026.

Content brought current: seven LLM providers (DeepSeek, OpenRouter and a
local Ollama / LM Studio endpoint join Claude, Kimi, Gemini and Azure
OpenAI), bring-your-own API keys, Opus 5 as the default; the per-org master
Skills list read as ArchiMate Capabilities; SOP and prompt provenance.
.docx regenerated with pandoc. T4151-T4153 (comparison-currency) green.

Co-Authored-By: Claude Fable 5.1 <noreply@anthropic.com>
</commit_message>
<xml_diff>
--- a/competitors/diagramatix-vs-signavio-aris-primebpm-2026-09.docx
+++ b/competitors/diagramatix-vs-signavio-aris-primebpm-2026-09.docx
@@ -20,7 +20,37 @@
           <w:i/>
           <w:iCs/>
         </w:rPr>
-        <w:t xml:space="preserve">Diagramatix data read from the current codebase (product 2.11, export SCHEMA_VERSION 48). Competitor data from public product pages and documentation accessed May–June 2026 —</w:t>
+        <w:t xml:space="preserve">Diagramatix data read from the current codebase</w:t>
+      </w:r>
+      <w:r>
+        <w:rPr>
+          <w:i/>
+          <w:iCs/>
+        </w:rPr>
+        <w:t xml:space="preserve"> </w:t>
+      </w:r>
+      <w:r>
+        <w:rPr>
+          <w:b/>
+          <w:bCs/>
+          <w:i/>
+          <w:iCs/>
+        </w:rPr>
+        <w:t xml:space="preserve">as at 14 September 2026</w:t>
+      </w:r>
+      <w:r>
+        <w:rPr>
+          <w:i/>
+          <w:iCs/>
+        </w:rPr>
+        <w:t xml:space="preserve"> </w:t>
+      </w:r>
+      <w:r>
+        <w:rPr>
+          <w:i/>
+          <w:iCs/>
+        </w:rPr>
+        <w:t xml:space="preserve">(product 2.11, export SCHEMA_VERSION 48). Competitor data from public product pages and documentation accessed May–June 2026 —</w:t>
       </w:r>
       <w:r>
         <w:rPr>
@@ -1008,7 +1038,55 @@
           <w:b/>
           <w:bCs/>
         </w:rPr>
-        <w:t xml:space="preserve">multiple LLM providers</w:t>
+        <w:t xml:space="preserve">seven LLM providers</w:t>
+      </w:r>
+      <w:r>
+        <w:t xml:space="preserve"> </w:t>
+      </w:r>
+      <w:r>
+        <w:t xml:space="preserve">(including</w:t>
+      </w:r>
+      <w:r>
+        <w:t xml:space="preserve"> </w:t>
+      </w:r>
+      <w:r>
+        <w:rPr>
+          <w:b/>
+          <w:bCs/>
+        </w:rPr>
+        <w:t xml:space="preserve">OpenRouter</w:t>
+      </w:r>
+      <w:r>
+        <w:t xml:space="preserve"> </w:t>
+      </w:r>
+      <w:r>
+        <w:t xml:space="preserve">and a fully</w:t>
+      </w:r>
+      <w:r>
+        <w:t xml:space="preserve"> </w:t>
+      </w:r>
+      <w:r>
+        <w:rPr>
+          <w:b/>
+          <w:bCs/>
+        </w:rPr>
+        <w:t xml:space="preserve">local Ollama / LM Studio</w:t>
+      </w:r>
+      <w:r>
+        <w:t xml:space="preserve"> </w:t>
+      </w:r>
+      <w:r>
+        <w:t xml:space="preserve">endpoint),</w:t>
+      </w:r>
+      <w:r>
+        <w:t xml:space="preserve"> </w:t>
+      </w:r>
+      <w:r>
+        <w:rPr>
+          <w:b/>
+          <w:bCs/>
+        </w:rPr>
+        <w:t xml:space="preserve">bring-your-own API keys</w:t>
       </w:r>
       <w:r>
         <w:t xml:space="preserve">,</w:t>
@@ -1357,7 +1435,7 @@
                 <w:b/>
                 <w:bCs/>
               </w:rPr>
-              <w:t xml:space="preserve">5 models live</w:t>
+              <w:t xml:space="preserve">7 providers live</w:t>
             </w:r>
             <w:r>
               <w:t xml:space="preserve"> </w:t>
@@ -1376,7 +1454,10 @@
               <w:t xml:space="preserve">Claude</w:t>
             </w:r>
             <w:r>
-              <w:t xml:space="preserve">, Moonshot</w:t>
+              <w:t xml:space="preserve"> </w:t>
+            </w:r>
+            <w:r>
+              <w:t xml:space="preserve">(Opus 5 default; Fable 5.1 catalogued), Moonshot</w:t>
             </w:r>
             <w:r>
               <w:t xml:space="preserve"> </w:t>
@@ -1412,23 +1493,71 @@
                 <w:b/>
                 <w:bCs/>
               </w:rPr>
-              <w:t xml:space="preserve">Azure OpenAI (GPT-5-mini class)</w:t>
-            </w:r>
-            <w:r>
-              <w:t xml:space="preserve"> </w:t>
-            </w:r>
-            <w:r>
-              <w:t xml:space="preserve">— admin-selectable;</w:t>
-            </w:r>
-            <w:r>
-              <w:t xml:space="preserve"> </w:t>
-            </w:r>
-            <w:r>
-              <w:rPr>
-                <w:b/>
-                <w:bCs/>
-              </w:rPr>
-              <w:t xml:space="preserve">self-hosted key or gateway</w:t>
+              <w:t xml:space="preserve">Azure OpenAI</w:t>
+            </w:r>
+            <w:r>
+              <w:t xml:space="preserve">,</w:t>
+            </w:r>
+            <w:r>
+              <w:t xml:space="preserve"> </w:t>
+            </w:r>
+            <w:r>
+              <w:rPr>
+                <w:b/>
+                <w:bCs/>
+              </w:rPr>
+              <w:t xml:space="preserve">DeepSeek</w:t>
+            </w:r>
+            <w:r>
+              <w:t xml:space="preserve">,</w:t>
+            </w:r>
+            <w:r>
+              <w:t xml:space="preserve"> </w:t>
+            </w:r>
+            <w:r>
+              <w:rPr>
+                <w:b/>
+                <w:bCs/>
+              </w:rPr>
+              <w:t xml:space="preserve">OpenRouter</w:t>
+            </w:r>
+            <w:r>
+              <w:t xml:space="preserve"> </w:t>
+            </w:r>
+            <w:r>
+              <w:t xml:space="preserve">(any model it routes) and</w:t>
+            </w:r>
+            <w:r>
+              <w:t xml:space="preserve"> </w:t>
+            </w:r>
+            <w:r>
+              <w:rPr>
+                <w:b/>
+                <w:bCs/>
+              </w:rPr>
+              <w:t xml:space="preserve">Ollama / LM Studio</w:t>
+            </w:r>
+            <w:r>
+              <w:t xml:space="preserve"> </w:t>
+            </w:r>
+            <w:r>
+              <w:t xml:space="preserve">for a fully local LLM — admin-selectable per generation;</w:t>
+            </w:r>
+            <w:r>
+              <w:t xml:space="preserve"> </w:t>
+            </w:r>
+            <w:r>
+              <w:rPr>
+                <w:b/>
+                <w:bCs/>
+              </w:rPr>
+              <w:t xml:space="preserve">bring-your-own API key</w:t>
+            </w:r>
+            <w:r>
+              <w:t xml:space="preserve"> </w:t>
+            </w:r>
+            <w:r>
+              <w:t xml:space="preserve">per user, self-hosted key or gateway</w:t>
             </w:r>
           </w:p>
         </w:tc>
@@ -3177,7 +3306,7 @@
           <w:b/>
           <w:bCs/>
         </w:rPr>
-        <w:t xml:space="preserve">LLM provider choice with per-org cost metering</w:t>
+        <w:t xml:space="preserve">LLM provider choice — seven, including a local model — with bring-your-own keys and per-org cost metering</w:t>
       </w:r>
       <w:r>
         <w:t xml:space="preserve">.</w:t>
@@ -9060,6 +9189,73 @@
           </w:p>
         </w:tc>
       </w:tr>
+      <w:tr>
+        <w:tc>
+          <w:tcPr/>
+          <w:p>
+            <w:pPr>
+              <w:pStyle w:val="Compact"/>
+            </w:pPr>
+            <w:r>
+              <w:rPr>
+                <w:b/>
+                <w:bCs/>
+              </w:rPr>
+              <w:t xml:space="preserve">Provenance</w:t>
+            </w:r>
+            <w:r>
+              <w:t xml:space="preserve"> </w:t>
+            </w:r>
+            <w:r>
+              <w:t xml:space="preserve">— who generated each SOP, when, and with which model</w:t>
+            </w:r>
+          </w:p>
+        </w:tc>
+        <w:tc>
+          <w:tcPr/>
+          <w:p>
+            <w:pPr>
+              <w:pStyle w:val="Compact"/>
+            </w:pPr>
+            <w:r>
+              <w:t xml:space="preserve">✅ recorded on every SOP and shown in the project’s SOP list</w:t>
+            </w:r>
+          </w:p>
+        </w:tc>
+        <w:tc>
+          <w:tcPr/>
+          <w:p>
+            <w:pPr>
+              <w:pStyle w:val="Compact"/>
+            </w:pPr>
+            <w:r>
+              <w:t xml:space="preserve">—</w:t>
+            </w:r>
+          </w:p>
+        </w:tc>
+        <w:tc>
+          <w:tcPr/>
+          <w:p>
+            <w:pPr>
+              <w:pStyle w:val="Compact"/>
+            </w:pPr>
+            <w:r>
+              <w:t xml:space="preserve">—</w:t>
+            </w:r>
+          </w:p>
+        </w:tc>
+        <w:tc>
+          <w:tcPr/>
+          <w:p>
+            <w:pPr>
+              <w:pStyle w:val="Compact"/>
+            </w:pPr>
+            <w:r>
+              <w:t xml:space="preserve">—</w:t>
+            </w:r>
+          </w:p>
+        </w:tc>
+      </w:tr>
     </w:tbl>
     <w:p>
       <w:pPr>
@@ -10217,7 +10413,36 @@
               <w:t xml:space="preserve"> </w:t>
             </w:r>
             <w:r>
-              <w:t xml:space="preserve">— named people, per-task required skills</w:t>
+              <w:t xml:space="preserve">— a per-org</w:t>
+            </w:r>
+            <w:r>
+              <w:t xml:space="preserve"> </w:t>
+            </w:r>
+            <w:r>
+              <w:rPr>
+                <w:b/>
+                <w:bCs/>
+              </w:rPr>
+              <w:t xml:space="preserve">master Skills list</w:t>
+            </w:r>
+            <w:r>
+              <w:t xml:space="preserve">; named people hold skills, tasks require them, and the same skills read as</w:t>
+            </w:r>
+            <w:r>
+              <w:t xml:space="preserve"> </w:t>
+            </w:r>
+            <w:r>
+              <w:rPr>
+                <w:b/>
+                <w:bCs/>
+              </w:rPr>
+              <w:t xml:space="preserve">ArchiMate Capabilities</w:t>
+            </w:r>
+            <w:r>
+              <w:t xml:space="preserve"> </w:t>
+            </w:r>
+            <w:r>
+              <w:t xml:space="preserve">in the operating-model view</w:t>
             </w:r>
           </w:p>
         </w:tc>
@@ -13156,7 +13381,7 @@
         <w:t xml:space="preserve"> </w:t>
       </w:r>
       <w:r>
-        <w:t xml:space="preserve">(5 LLMs) and</w:t>
+        <w:t xml:space="preserve">(7 providers, including a local model, bring-your-own keys) and</w:t>
       </w:r>
       <w:r>
         <w:t xml:space="preserve"> </w:t>
@@ -13607,7 +13832,7 @@
         <w:t xml:space="preserve"> </w:t>
       </w:r>
       <w:r>
-        <w:t xml:space="preserve">(26 value chains, 277 processes, 381 editable prompts).</w:t>
+        <w:t xml:space="preserve">(26 value chains, 277 processes, 381 editable prompts — each recording its provenance: typed, dictated, refined, or from an image).</w:t>
       </w:r>
     </w:p>
     <w:p>
@@ -14732,7 +14957,7 @@
           <w:b/>
           <w:bCs/>
         </w:rPr>
-        <w:t xml:space="preserve">September 2026</w:t>
+        <w:t xml:space="preserve">14 September 2026</w:t>
       </w:r>
       <w:r>
         <w:t xml:space="preserve">, product 2.11):</w:t>

</xml_diff>

<commit_message>
docs(competitors): the date on its own line under the title
Co-Authored-By: Claude Fable 5.1 <noreply@anthropic.com>
</commit_message>
<xml_diff>
--- a/competitors/diagramatix-vs-signavio-aris-primebpm-2026-09.docx
+++ b/competitors/diagramatix-vs-signavio-aris-primebpm-2026-09.docx
@@ -14,6 +14,24 @@
     <w:p>
       <w:pPr>
         <w:pStyle w:val="FirstParagraph"/>
+      </w:pPr>
+      <w:r>
+        <w:rPr>
+          <w:b/>
+          <w:bCs/>
+        </w:rPr>
+        <w:t xml:space="preserve">Date: 14 September 2026</w:t>
+      </w:r>
+      <w:r>
+        <w:t xml:space="preserve"> </w:t>
+      </w:r>
+      <w:r>
+        <w:t xml:space="preserve">· September 2026 edition · product 2.11</w:t>
+      </w:r>
+    </w:p>
+    <w:p>
+      <w:pPr>
+        <w:pStyle w:val="BodyText"/>
       </w:pPr>
       <w:r>
         <w:rPr>

</xml_diff>

<commit_message>
Updated Competitor Analysis and Features doco
</commit_message>
<xml_diff>
--- a/competitors/diagramatix-vs-signavio-aris-primebpm-2026-09.docx
+++ b/competitors/diagramatix-vs-signavio-aris-primebpm-2026-09.docx
@@ -194,7 +194,7 @@
                 <w:b/>
                 <w:bCs/>
               </w:rPr>
-              <w:t xml:space="preserve">ten notations</w:t>
+              <w:t xml:space="preserve">nine notations</w:t>
             </w:r>
             <w:r>
               <w:t xml:space="preserve"> </w:t>
@@ -213,7 +213,7 @@
               <w:t xml:space="preserve">EPC</w:t>
             </w:r>
             <w:r>
-              <w:t xml:space="preserve">, ArchiMate, Standard Flowchart, Value Chain, State Machine, Domain, Context, Process Context and Basic. Differentiators: an opinionated</w:t>
+              <w:t xml:space="preserve">, ArchiMate, Standard Flowchart, Value Chain, State Machine, Domain, Context and Process Context. Differentiators: an opinionated</w:t>
             </w:r>
             <w:r>
               <w:t xml:space="preserve"> </w:t>
@@ -1346,7 +1346,7 @@
                 <w:b/>
                 <w:bCs/>
               </w:rPr>
-              <w:t xml:space="preserve">Text → 10 notations</w:t>
+              <w:t xml:space="preserve">Text → 9 notations</w:t>
             </w:r>
             <w:r>
               <w:t xml:space="preserve">: BPMN and</w:t>
@@ -1378,7 +1378,7 @@
               <w:t xml:space="preserve">ArchiMate</w:t>
             </w:r>
             <w:r>
-              <w:t xml:space="preserve">, Standard Flowchart, State Machine, Domain, Context, Process Context, Value Chain, Basic</w:t>
+              <w:t xml:space="preserve">, Standard Flowchart, State Machine, Domain, Context, Process Context, Value Chain</w:t>
             </w:r>
           </w:p>
         </w:tc>
@@ -2737,7 +2737,7 @@
           <w:b/>
           <w:bCs/>
         </w:rPr>
-        <w:t xml:space="preserve">ten notations</w:t>
+        <w:t xml:space="preserve">nine notations</w:t>
       </w:r>
       <w:r>
         <w:t xml:space="preserve"> </w:t>
@@ -3057,7 +3057,7 @@
           <w:b/>
           <w:bCs/>
         </w:rPr>
-        <w:t xml:space="preserve">10 notations</w:t>
+        <w:t xml:space="preserve">9 notations</w:t>
       </w:r>
       <w:r>
         <w:t xml:space="preserve"> </w:t>
@@ -13425,7 +13425,7 @@
           <w:b/>
           <w:bCs/>
         </w:rPr>
-        <w:t xml:space="preserve">all ten notations</w:t>
+        <w:t xml:space="preserve">all nine notations</w:t>
       </w:r>
       <w:r>
         <w:t xml:space="preserve">;</w:t>

</xml_diff>